<commit_message>
Add batch generation, Open Estate wizard, and Broward local forms
- Fix P3-0100 template: add {petitioner_address}, {signing_year},
  {attorney_address}, {attorney_name} tags that were missing
- Add multi-select form picker with bundle presets and merged/deduped
  fields across all selected forms
- Generate single .docx for one form or .zip for multiple
- Add Open Estate wizard: guided questions (admin type, testate/intestate,
  domiciliary/ancillary, petitioners, county) auto-select correct forms
  from a matrix covering all formal + summary admin variants
- Create Broward County local form templates:
  BW-0010 Affidavit Regarding Criminal History
  BW-0020 Mandatory Checklist for Formal Admin Testate
- County-aware bundles: Broward triggers local forms automatically
- Manual form selection preserved as collapsible fallback

Co-Authored-By: Claude Opus 4.6 (1M context) <noreply@anthropic.com>
</commit_message>
<xml_diff>
--- a/templates/P3-0100.docx
+++ b/templates/P3-0100.docx
@@ -691,7 +691,7 @@
           <w:sz w:val="20"/>
           <w:szCs w:val="20"/>
         </w:rPr>
-        <w:t>Petitioner's address is</w:t>
+        <w:t>Petitioner's address is {petitioner_address}</w:t>
       </w:r>
       <w:r>
         <w:rPr>
@@ -3429,7 +3429,7 @@
           <w:sz w:val="20"/>
           <w:szCs w:val="20"/>
         </w:rPr>
-        <w:t xml:space="preserve"> this {signing_day} day of {signing_month}, ________.</w:t>
+        <w:t xml:space="preserve"> this {signing_day} day of {signing_month}, {signing_year}.</w:t>
       </w:r>
     </w:p>
     <w:p>
@@ -3711,6 +3711,25 @@
     <w:p>
       <w:pPr>
         <w:widowControl/>
+        <w:jc w:val="left"/>
+        <w:rPr>
+          <w:rFonts w:ascii="Arial" w:hAnsi="Arial" w:cs="Arial"/>
+          <w:sz w:val="20"/>
+          <w:szCs w:val="20"/>
+        </w:rPr>
+      </w:pPr>
+      <w:r>
+        <w:rPr>
+          <w:rFonts w:ascii="Arial" w:hAnsi="Arial" w:cs="Arial"/>
+          <w:sz w:val="20"/>
+          <w:szCs w:val="20"/>
+        </w:rPr>
+        <w:t>{attorney_name}</w:t>
+      </w:r>
+    </w:p>
+    <w:p>
+      <w:pPr>
+        <w:widowControl/>
         <w:tabs>
           <w:tab w:val="center" w:pos="2160"/>
         </w:tabs>
@@ -3949,7 +3968,7 @@
           <w:szCs w:val="20"/>
         </w:rPr>
         <w:tab/>
-        <w:t>(address)</w:t>
+        <w:t>{attorney_address}</w:t>
       </w:r>
     </w:p>
     <w:p>

</xml_diff>